<commit_message>
Update .gitignore, add new document on hospital efficiency, and archive variable renaming script
</commit_message>
<xml_diff>
--- a/docs/resumen_diseno_empirico_tesis.docx
+++ b/docs/resumen_diseno_empirico_tesis.docx
@@ -6,6 +6,9 @@
       <w:pPr>
         <w:spacing w:before="600"/>
       </w:pPr>
+      <w:r>
+        <w:tab/>
+      </w:r>
     </w:p>
     <w:p>
       <w:pPr>
@@ -44,12 +47,6 @@
         <w:gridCol w:w="9026"/>
       </w:tblGrid>
       <w:tr>
-        <w:tblPrEx>
-          <w:tblCellMar>
-            <w:top w:w="0" w:type="dxa"/>
-            <w:bottom w:w="0" w:type="dxa"/>
-          </w:tblCellMar>
-        </w:tblPrEx>
         <w:tc>
           <w:tcPr>
             <w:tcW w:w="9026" w:type="dxa"/>
@@ -347,12 +344,6 @@
         <w:gridCol w:w="9200"/>
       </w:tblGrid>
       <w:tr>
-        <w:tblPrEx>
-          <w:tblCellMar>
-            <w:top w:w="0" w:type="dxa"/>
-            <w:bottom w:w="0" w:type="dxa"/>
-          </w:tblCellMar>
-        </w:tblPrEx>
         <w:tc>
           <w:tcPr>
             <w:tcW w:w="9200" w:type="dxa"/>
@@ -495,12 +486,6 @@
         <w:gridCol w:w="1400"/>
       </w:tblGrid>
       <w:tr>
-        <w:tblPrEx>
-          <w:tblCellMar>
-            <w:top w:w="0" w:type="dxa"/>
-            <w:bottom w:w="0" w:type="dxa"/>
-          </w:tblCellMar>
-        </w:tblPrEx>
         <w:trPr>
           <w:tblHeader/>
         </w:trPr>
@@ -671,12 +656,6 @@
         </w:tc>
       </w:tr>
       <w:tr>
-        <w:tblPrEx>
-          <w:tblCellMar>
-            <w:top w:w="0" w:type="dxa"/>
-            <w:bottom w:w="0" w:type="dxa"/>
-          </w:tblCellMar>
-        </w:tblPrEx>
         <w:tc>
           <w:tcPr>
             <w:tcW w:w="1400" w:type="dxa"/>
@@ -814,12 +793,6 @@
         </w:tc>
       </w:tr>
       <w:tr>
-        <w:tblPrEx>
-          <w:tblCellMar>
-            <w:top w:w="0" w:type="dxa"/>
-            <w:bottom w:w="0" w:type="dxa"/>
-          </w:tblCellMar>
-        </w:tblPrEx>
         <w:tc>
           <w:tcPr>
             <w:tcW w:w="1400" w:type="dxa"/>
@@ -957,12 +930,6 @@
         </w:tc>
       </w:tr>
       <w:tr>
-        <w:tblPrEx>
-          <w:tblCellMar>
-            <w:top w:w="0" w:type="dxa"/>
-            <w:bottom w:w="0" w:type="dxa"/>
-          </w:tblCellMar>
-        </w:tblPrEx>
         <w:tc>
           <w:tcPr>
             <w:tcW w:w="1400" w:type="dxa"/>
@@ -1101,12 +1068,6 @@
         </w:tc>
       </w:tr>
       <w:tr>
-        <w:tblPrEx>
-          <w:tblCellMar>
-            <w:top w:w="0" w:type="dxa"/>
-            <w:bottom w:w="0" w:type="dxa"/>
-          </w:tblCellMar>
-        </w:tblPrEx>
         <w:tc>
           <w:tcPr>
             <w:tcW w:w="1400" w:type="dxa"/>
@@ -1244,12 +1205,6 @@
         </w:tc>
       </w:tr>
       <w:tr>
-        <w:tblPrEx>
-          <w:tblCellMar>
-            <w:top w:w="0" w:type="dxa"/>
-            <w:bottom w:w="0" w:type="dxa"/>
-          </w:tblCellMar>
-        </w:tblPrEx>
         <w:tc>
           <w:tcPr>
             <w:tcW w:w="1400" w:type="dxa"/>
@@ -1413,12 +1368,6 @@
         <w:gridCol w:w="9200"/>
       </w:tblGrid>
       <w:tr>
-        <w:tblPrEx>
-          <w:tblCellMar>
-            <w:top w:w="0" w:type="dxa"/>
-            <w:bottom w:w="0" w:type="dxa"/>
-          </w:tblCellMar>
-        </w:tblPrEx>
         <w:tc>
           <w:tcPr>
             <w:tcW w:w="9200" w:type="dxa"/>
@@ -1513,12 +1462,6 @@
         <w:gridCol w:w="2202"/>
       </w:tblGrid>
       <w:tr>
-        <w:tblPrEx>
-          <w:tblCellMar>
-            <w:top w:w="0" w:type="dxa"/>
-            <w:bottom w:w="0" w:type="dxa"/>
-          </w:tblCellMar>
-        </w:tblPrEx>
         <w:trPr>
           <w:tblHeader/>
         </w:trPr>
@@ -1703,12 +1646,6 @@
         </w:tc>
       </w:tr>
       <w:tr>
-        <w:tblPrEx>
-          <w:tblCellMar>
-            <w:top w:w="0" w:type="dxa"/>
-            <w:bottom w:w="0" w:type="dxa"/>
-          </w:tblCellMar>
-        </w:tblPrEx>
         <w:tc>
           <w:tcPr>
             <w:tcW w:w="700" w:type="dxa"/>
@@ -1846,12 +1783,6 @@
         </w:tc>
       </w:tr>
       <w:tr>
-        <w:tblPrEx>
-          <w:tblCellMar>
-            <w:top w:w="0" w:type="dxa"/>
-            <w:bottom w:w="0" w:type="dxa"/>
-          </w:tblCellMar>
-        </w:tblPrEx>
         <w:tc>
           <w:tcPr>
             <w:tcW w:w="700" w:type="dxa"/>
@@ -2005,12 +1936,6 @@
         </w:tc>
       </w:tr>
       <w:tr>
-        <w:tblPrEx>
-          <w:tblCellMar>
-            <w:top w:w="0" w:type="dxa"/>
-            <w:bottom w:w="0" w:type="dxa"/>
-          </w:tblCellMar>
-        </w:tblPrEx>
         <w:tc>
           <w:tcPr>
             <w:tcW w:w="700" w:type="dxa"/>
@@ -2148,12 +2073,6 @@
         </w:tc>
       </w:tr>
       <w:tr>
-        <w:tblPrEx>
-          <w:tblCellMar>
-            <w:top w:w="0" w:type="dxa"/>
-            <w:bottom w:w="0" w:type="dxa"/>
-          </w:tblCellMar>
-        </w:tblPrEx>
         <w:tc>
           <w:tcPr>
             <w:tcW w:w="700" w:type="dxa"/>
@@ -2450,12 +2369,6 @@
         <w:gridCol w:w="9200"/>
       </w:tblGrid>
       <w:tr>
-        <w:tblPrEx>
-          <w:tblCellMar>
-            <w:top w:w="0" w:type="dxa"/>
-            <w:bottom w:w="0" w:type="dxa"/>
-          </w:tblCellMar>
-        </w:tblPrEx>
         <w:tc>
           <w:tcPr>
             <w:tcW w:w="9200" w:type="dxa"/>
@@ -2624,12 +2537,6 @@
         <w:gridCol w:w="9200"/>
       </w:tblGrid>
       <w:tr>
-        <w:tblPrEx>
-          <w:tblCellMar>
-            <w:top w:w="0" w:type="dxa"/>
-            <w:bottom w:w="0" w:type="dxa"/>
-          </w:tblCellMar>
-        </w:tblPrEx>
         <w:tc>
           <w:tcPr>
             <w:tcW w:w="9200" w:type="dxa"/>
@@ -2839,7 +2746,15 @@
         <w:spacing w:before="60" w:after="100"/>
       </w:pPr>
       <w:r>
-        <w:t xml:space="preserve">Estima una única función de distancia output (ODF) </w:t>
+        <w:t>Estima una única función de distancia output (</w:t>
+      </w:r>
+      <w:proofErr w:type="spellStart"/>
+      <w:r>
+        <w:t>ODF</w:t>
+      </w:r>
+      <w:proofErr w:type="spellEnd"/>
+      <w:r>
+        <w:t xml:space="preserve">) </w:t>
       </w:r>
       <w:proofErr w:type="spellStart"/>
       <w:r>
@@ -2990,12 +2905,6 @@
         <w:gridCol w:w="1900"/>
       </w:tblGrid>
       <w:tr>
-        <w:tblPrEx>
-          <w:tblCellMar>
-            <w:top w:w="0" w:type="dxa"/>
-            <w:bottom w:w="0" w:type="dxa"/>
-          </w:tblCellMar>
-        </w:tblPrEx>
         <w:trPr>
           <w:tblHeader/>
         </w:trPr>
@@ -3133,12 +3042,6 @@
         </w:tc>
       </w:tr>
       <w:tr>
-        <w:tblPrEx>
-          <w:tblCellMar>
-            <w:top w:w="0" w:type="dxa"/>
-            <w:bottom w:w="0" w:type="dxa"/>
-          </w:tblCellMar>
-        </w:tblPrEx>
         <w:tc>
           <w:tcPr>
             <w:tcW w:w="1500" w:type="dxa"/>
@@ -3249,12 +3152,6 @@
         </w:tc>
       </w:tr>
       <w:tr>
-        <w:tblPrEx>
-          <w:tblCellMar>
-            <w:top w:w="0" w:type="dxa"/>
-            <w:bottom w:w="0" w:type="dxa"/>
-          </w:tblCellMar>
-        </w:tblPrEx>
         <w:tc>
           <w:tcPr>
             <w:tcW w:w="1500" w:type="dxa"/>
@@ -3374,12 +3271,6 @@
         </w:tc>
       </w:tr>
       <w:tr>
-        <w:tblPrEx>
-          <w:tblCellMar>
-            <w:top w:w="0" w:type="dxa"/>
-            <w:bottom w:w="0" w:type="dxa"/>
-          </w:tblCellMar>
-        </w:tblPrEx>
         <w:tc>
           <w:tcPr>
             <w:tcW w:w="1500" w:type="dxa"/>
@@ -3499,12 +3390,6 @@
         </w:tc>
       </w:tr>
       <w:tr>
-        <w:tblPrEx>
-          <w:tblCellMar>
-            <w:top w:w="0" w:type="dxa"/>
-            <w:bottom w:w="0" w:type="dxa"/>
-          </w:tblCellMar>
-        </w:tblPrEx>
         <w:tc>
           <w:tcPr>
             <w:tcW w:w="1500" w:type="dxa"/>
@@ -3624,12 +3509,6 @@
         </w:tc>
       </w:tr>
       <w:tr>
-        <w:tblPrEx>
-          <w:tblCellMar>
-            <w:top w:w="0" w:type="dxa"/>
-            <w:bottom w:w="0" w:type="dxa"/>
-          </w:tblCellMar>
-        </w:tblPrEx>
         <w:tc>
           <w:tcPr>
             <w:tcW w:w="1500" w:type="dxa"/>
@@ -3740,12 +3619,6 @@
         </w:tc>
       </w:tr>
       <w:tr>
-        <w:tblPrEx>
-          <w:tblCellMar>
-            <w:top w:w="0" w:type="dxa"/>
-            <w:bottom w:w="0" w:type="dxa"/>
-          </w:tblCellMar>
-        </w:tblPrEx>
         <w:tc>
           <w:tcPr>
             <w:tcW w:w="1500" w:type="dxa"/>
@@ -3856,12 +3729,6 @@
         </w:tc>
       </w:tr>
       <w:tr>
-        <w:tblPrEx>
-          <w:tblCellMar>
-            <w:top w:w="0" w:type="dxa"/>
-            <w:bottom w:w="0" w:type="dxa"/>
-          </w:tblCellMar>
-        </w:tblPrEx>
         <w:tc>
           <w:tcPr>
             <w:tcW w:w="1500" w:type="dxa"/>
@@ -3990,12 +3857,6 @@
         </w:tc>
       </w:tr>
       <w:tr>
-        <w:tblPrEx>
-          <w:tblCellMar>
-            <w:top w:w="0" w:type="dxa"/>
-            <w:bottom w:w="0" w:type="dxa"/>
-          </w:tblCellMar>
-        </w:tblPrEx>
         <w:tc>
           <w:tcPr>
             <w:tcW w:w="1500" w:type="dxa"/>
@@ -4122,12 +3983,6 @@
         </w:tc>
       </w:tr>
       <w:tr>
-        <w:tblPrEx>
-          <w:tblCellMar>
-            <w:top w:w="0" w:type="dxa"/>
-            <w:bottom w:w="0" w:type="dxa"/>
-          </w:tblCellMar>
-        </w:tblPrEx>
         <w:tc>
           <w:tcPr>
             <w:tcW w:w="1500" w:type="dxa"/>
@@ -4240,12 +4095,6 @@
         </w:tc>
       </w:tr>
       <w:tr>
-        <w:tblPrEx>
-          <w:tblCellMar>
-            <w:top w:w="0" w:type="dxa"/>
-            <w:bottom w:w="0" w:type="dxa"/>
-          </w:tblCellMar>
-        </w:tblPrEx>
         <w:tc>
           <w:tcPr>
             <w:tcW w:w="1500" w:type="dxa"/>
@@ -4358,12 +4207,6 @@
         </w:tc>
       </w:tr>
       <w:tr>
-        <w:tblPrEx>
-          <w:tblCellMar>
-            <w:top w:w="0" w:type="dxa"/>
-            <w:bottom w:w="0" w:type="dxa"/>
-          </w:tblCellMar>
-        </w:tblPrEx>
         <w:tc>
           <w:tcPr>
             <w:tcW w:w="1500" w:type="dxa"/>
@@ -4522,12 +4365,6 @@
         <w:gridCol w:w="1300"/>
       </w:tblGrid>
       <w:tr>
-        <w:tblPrEx>
-          <w:tblCellMar>
-            <w:top w:w="0" w:type="dxa"/>
-            <w:bottom w:w="0" w:type="dxa"/>
-          </w:tblCellMar>
-        </w:tblPrEx>
         <w:trPr>
           <w:tblHeader/>
         </w:trPr>
@@ -4665,12 +4502,6 @@
         </w:tc>
       </w:tr>
       <w:tr>
-        <w:tblPrEx>
-          <w:tblCellMar>
-            <w:top w:w="0" w:type="dxa"/>
-            <w:bottom w:w="0" w:type="dxa"/>
-          </w:tblCellMar>
-        </w:tblPrEx>
         <w:tc>
           <w:tcPr>
             <w:tcW w:w="2100" w:type="dxa"/>
@@ -4797,12 +4628,6 @@
         </w:tc>
       </w:tr>
       <w:tr>
-        <w:tblPrEx>
-          <w:tblCellMar>
-            <w:top w:w="0" w:type="dxa"/>
-            <w:bottom w:w="0" w:type="dxa"/>
-          </w:tblCellMar>
-        </w:tblPrEx>
         <w:tc>
           <w:tcPr>
             <w:tcW w:w="2100" w:type="dxa"/>
@@ -4929,12 +4754,6 @@
         </w:tc>
       </w:tr>
       <w:tr>
-        <w:tblPrEx>
-          <w:tblCellMar>
-            <w:top w:w="0" w:type="dxa"/>
-            <w:bottom w:w="0" w:type="dxa"/>
-          </w:tblCellMar>
-        </w:tblPrEx>
         <w:tc>
           <w:tcPr>
             <w:tcW w:w="2100" w:type="dxa"/>
@@ -5054,12 +4873,6 @@
         </w:tc>
       </w:tr>
       <w:tr>
-        <w:tblPrEx>
-          <w:tblCellMar>
-            <w:top w:w="0" w:type="dxa"/>
-            <w:bottom w:w="0" w:type="dxa"/>
-          </w:tblCellMar>
-        </w:tblPrEx>
         <w:tc>
           <w:tcPr>
             <w:tcW w:w="2100" w:type="dxa"/>
@@ -5170,12 +4983,6 @@
         </w:tc>
       </w:tr>
       <w:tr>
-        <w:tblPrEx>
-          <w:tblCellMar>
-            <w:top w:w="0" w:type="dxa"/>
-            <w:bottom w:w="0" w:type="dxa"/>
-          </w:tblCellMar>
-        </w:tblPrEx>
         <w:tc>
           <w:tcPr>
             <w:tcW w:w="2100" w:type="dxa"/>
@@ -5286,12 +5093,6 @@
         </w:tc>
       </w:tr>
       <w:tr>
-        <w:tblPrEx>
-          <w:tblCellMar>
-            <w:top w:w="0" w:type="dxa"/>
-            <w:bottom w:w="0" w:type="dxa"/>
-          </w:tblCellMar>
-        </w:tblPrEx>
         <w:tc>
           <w:tcPr>
             <w:tcW w:w="2100" w:type="dxa"/>
@@ -5448,12 +5249,6 @@
         <w:gridCol w:w="2100"/>
       </w:tblGrid>
       <w:tr>
-        <w:tblPrEx>
-          <w:tblCellMar>
-            <w:top w:w="0" w:type="dxa"/>
-            <w:bottom w:w="0" w:type="dxa"/>
-          </w:tblCellMar>
-        </w:tblPrEx>
         <w:trPr>
           <w:tblHeader/>
         </w:trPr>
@@ -5558,12 +5353,6 @@
         </w:tc>
       </w:tr>
       <w:tr>
-        <w:tblPrEx>
-          <w:tblCellMar>
-            <w:top w:w="0" w:type="dxa"/>
-            <w:bottom w:w="0" w:type="dxa"/>
-          </w:tblCellMar>
-        </w:tblPrEx>
         <w:tc>
           <w:tcPr>
             <w:tcW w:w="2600" w:type="dxa"/>
@@ -5663,12 +5452,6 @@
         </w:tc>
       </w:tr>
       <w:tr>
-        <w:tblPrEx>
-          <w:tblCellMar>
-            <w:top w:w="0" w:type="dxa"/>
-            <w:bottom w:w="0" w:type="dxa"/>
-          </w:tblCellMar>
-        </w:tblPrEx>
         <w:tc>
           <w:tcPr>
             <w:tcW w:w="2600" w:type="dxa"/>
@@ -5786,12 +5569,6 @@
         </w:tc>
       </w:tr>
       <w:tr>
-        <w:tblPrEx>
-          <w:tblCellMar>
-            <w:top w:w="0" w:type="dxa"/>
-            <w:bottom w:w="0" w:type="dxa"/>
-          </w:tblCellMar>
-        </w:tblPrEx>
         <w:tc>
           <w:tcPr>
             <w:tcW w:w="2600" w:type="dxa"/>
@@ -5881,12 +5658,6 @@
         </w:tc>
       </w:tr>
       <w:tr>
-        <w:tblPrEx>
-          <w:tblCellMar>
-            <w:top w:w="0" w:type="dxa"/>
-            <w:bottom w:w="0" w:type="dxa"/>
-          </w:tblCellMar>
-        </w:tblPrEx>
         <w:tc>
           <w:tcPr>
             <w:tcW w:w="2600" w:type="dxa"/>
@@ -5970,12 +5741,6 @@
         </w:tc>
       </w:tr>
       <w:tr>
-        <w:tblPrEx>
-          <w:tblCellMar>
-            <w:top w:w="0" w:type="dxa"/>
-            <w:bottom w:w="0" w:type="dxa"/>
-          </w:tblCellMar>
-        </w:tblPrEx>
         <w:tc>
           <w:tcPr>
             <w:tcW w:w="2600" w:type="dxa"/>
@@ -6104,12 +5869,6 @@
         <w:gridCol w:w="2500"/>
       </w:tblGrid>
       <w:tr>
-        <w:tblPrEx>
-          <w:tblCellMar>
-            <w:top w:w="0" w:type="dxa"/>
-            <w:bottom w:w="0" w:type="dxa"/>
-          </w:tblCellMar>
-        </w:tblPrEx>
         <w:trPr>
           <w:tblHeader/>
         </w:trPr>
@@ -6249,12 +6008,6 @@
         </w:tc>
       </w:tr>
       <w:tr>
-        <w:tblPrEx>
-          <w:tblCellMar>
-            <w:top w:w="0" w:type="dxa"/>
-            <w:bottom w:w="0" w:type="dxa"/>
-          </w:tblCellMar>
-        </w:tblPrEx>
         <w:tc>
           <w:tcPr>
             <w:tcW w:w="1100" w:type="dxa"/>
@@ -6415,12 +6168,6 @@
         </w:tc>
       </w:tr>
       <w:tr>
-        <w:tblPrEx>
-          <w:tblCellMar>
-            <w:top w:w="0" w:type="dxa"/>
-            <w:bottom w:w="0" w:type="dxa"/>
-          </w:tblCellMar>
-        </w:tblPrEx>
         <w:tc>
           <w:tcPr>
             <w:tcW w:w="1100" w:type="dxa"/>
@@ -6549,12 +6296,6 @@
         </w:tc>
       </w:tr>
       <w:tr>
-        <w:tblPrEx>
-          <w:tblCellMar>
-            <w:top w:w="0" w:type="dxa"/>
-            <w:bottom w:w="0" w:type="dxa"/>
-          </w:tblCellMar>
-        </w:tblPrEx>
         <w:tc>
           <w:tcPr>
             <w:tcW w:w="1100" w:type="dxa"/>
@@ -6683,12 +6424,6 @@
         </w:tc>
       </w:tr>
       <w:tr>
-        <w:tblPrEx>
-          <w:tblCellMar>
-            <w:top w:w="0" w:type="dxa"/>
-            <w:bottom w:w="0" w:type="dxa"/>
-          </w:tblCellMar>
-        </w:tblPrEx>
         <w:tc>
           <w:tcPr>
             <w:tcW w:w="1100" w:type="dxa"/>
@@ -6875,12 +6610,6 @@
         <w:gridCol w:w="9200"/>
       </w:tblGrid>
       <w:tr>
-        <w:tblPrEx>
-          <w:tblCellMar>
-            <w:top w:w="0" w:type="dxa"/>
-            <w:bottom w:w="0" w:type="dxa"/>
-          </w:tblCellMar>
-        </w:tblPrEx>
         <w:tc>
           <w:tcPr>
             <w:tcW w:w="9200" w:type="dxa"/>
@@ -7054,12 +6783,6 @@
         <w:gridCol w:w="1521"/>
       </w:tblGrid>
       <w:tr>
-        <w:tblPrEx>
-          <w:tblCellMar>
-            <w:top w:w="0" w:type="dxa"/>
-            <w:bottom w:w="0" w:type="dxa"/>
-          </w:tblCellMar>
-        </w:tblPrEx>
         <w:trPr>
           <w:tblHeader/>
         </w:trPr>
@@ -7198,12 +6921,6 @@
         </w:tc>
       </w:tr>
       <w:tr>
-        <w:tblPrEx>
-          <w:tblCellMar>
-            <w:top w:w="0" w:type="dxa"/>
-            <w:bottom w:w="0" w:type="dxa"/>
-          </w:tblCellMar>
-        </w:tblPrEx>
         <w:tc>
           <w:tcPr>
             <w:tcW w:w="1300" w:type="dxa"/>
@@ -7362,12 +7079,6 @@
         </w:tc>
       </w:tr>
       <w:tr>
-        <w:tblPrEx>
-          <w:tblCellMar>
-            <w:top w:w="0" w:type="dxa"/>
-            <w:bottom w:w="0" w:type="dxa"/>
-          </w:tblCellMar>
-        </w:tblPrEx>
         <w:tc>
           <w:tcPr>
             <w:tcW w:w="1300" w:type="dxa"/>
@@ -7503,12 +7214,6 @@
         </w:tc>
       </w:tr>
       <w:tr>
-        <w:tblPrEx>
-          <w:tblCellMar>
-            <w:top w:w="0" w:type="dxa"/>
-            <w:bottom w:w="0" w:type="dxa"/>
-          </w:tblCellMar>
-        </w:tblPrEx>
         <w:tc>
           <w:tcPr>
             <w:tcW w:w="1300" w:type="dxa"/>
@@ -7619,12 +7324,6 @@
         </w:tc>
       </w:tr>
       <w:tr>
-        <w:tblPrEx>
-          <w:tblCellMar>
-            <w:top w:w="0" w:type="dxa"/>
-            <w:bottom w:w="0" w:type="dxa"/>
-          </w:tblCellMar>
-        </w:tblPrEx>
         <w:tc>
           <w:tcPr>
             <w:tcW w:w="1300" w:type="dxa"/>
@@ -7744,12 +7443,6 @@
         </w:tc>
       </w:tr>
       <w:tr>
-        <w:tblPrEx>
-          <w:tblCellMar>
-            <w:top w:w="0" w:type="dxa"/>
-            <w:bottom w:w="0" w:type="dxa"/>
-          </w:tblCellMar>
-        </w:tblPrEx>
         <w:tc>
           <w:tcPr>
             <w:tcW w:w="1300" w:type="dxa"/>
@@ -7897,12 +7590,6 @@
         <w:gridCol w:w="9200"/>
       </w:tblGrid>
       <w:tr>
-        <w:tblPrEx>
-          <w:tblCellMar>
-            <w:top w:w="0" w:type="dxa"/>
-            <w:bottom w:w="0" w:type="dxa"/>
-          </w:tblCellMar>
-        </w:tblPrEx>
         <w:tc>
           <w:tcPr>
             <w:tcW w:w="9200" w:type="dxa"/>
@@ -7936,12 +7623,6 @@
         </w:tc>
       </w:tr>
       <w:tr>
-        <w:tblPrEx>
-          <w:tblCellMar>
-            <w:top w:w="0" w:type="dxa"/>
-            <w:bottom w:w="0" w:type="dxa"/>
-          </w:tblCellMar>
-        </w:tblPrEx>
         <w:tc>
           <w:tcPr>
             <w:tcW w:w="9200" w:type="dxa"/>
@@ -8045,12 +7726,6 @@
         </w:tc>
       </w:tr>
       <w:tr>
-        <w:tblPrEx>
-          <w:tblCellMar>
-            <w:top w:w="0" w:type="dxa"/>
-            <w:bottom w:w="0" w:type="dxa"/>
-          </w:tblCellMar>
-        </w:tblPrEx>
         <w:tc>
           <w:tcPr>
             <w:tcW w:w="9200" w:type="dxa"/>
@@ -8084,12 +7759,6 @@
         </w:tc>
       </w:tr>
       <w:tr>
-        <w:tblPrEx>
-          <w:tblCellMar>
-            <w:top w:w="0" w:type="dxa"/>
-            <w:bottom w:w="0" w:type="dxa"/>
-          </w:tblCellMar>
-        </w:tblPrEx>
         <w:tc>
           <w:tcPr>
             <w:tcW w:w="9200" w:type="dxa"/>
@@ -8151,7 +7820,15 @@
               <w:t xml:space="preserve">•  </w:t>
             </w:r>
             <w:r>
-              <w:t xml:space="preserve">Contrastes P1–P* mediante Wald </w:t>
+              <w:t xml:space="preserve">Contrastes </w:t>
+            </w:r>
+            <w:proofErr w:type="spellStart"/>
+            <w:r>
+              <w:t>P1</w:t>
+            </w:r>
+            <w:proofErr w:type="spellEnd"/>
+            <w:r>
+              <w:t xml:space="preserve">–P* mediante Wald </w:t>
             </w:r>
             <w:proofErr w:type="spellStart"/>
             <w:r>
@@ -8223,12 +7900,6 @@
         </w:tc>
       </w:tr>
       <w:tr>
-        <w:tblPrEx>
-          <w:tblCellMar>
-            <w:top w:w="0" w:type="dxa"/>
-            <w:bottom w:w="0" w:type="dxa"/>
-          </w:tblCellMar>
-        </w:tblPrEx>
         <w:tc>
           <w:tcPr>
             <w:tcW w:w="9200" w:type="dxa"/>
@@ -8262,12 +7933,6 @@
         </w:tc>
       </w:tr>
       <w:tr>
-        <w:tblPrEx>
-          <w:tblCellMar>
-            <w:top w:w="0" w:type="dxa"/>
-            <w:bottom w:w="0" w:type="dxa"/>
-          </w:tblCellMar>
-        </w:tblPrEx>
         <w:tc>
           <w:tcPr>
             <w:tcW w:w="9200" w:type="dxa"/>
@@ -8346,12 +8011,6 @@
         </w:tc>
       </w:tr>
       <w:tr>
-        <w:tblPrEx>
-          <w:tblCellMar>
-            <w:top w:w="0" w:type="dxa"/>
-            <w:bottom w:w="0" w:type="dxa"/>
-          </w:tblCellMar>
-        </w:tblPrEx>
         <w:tc>
           <w:tcPr>
             <w:tcW w:w="9200" w:type="dxa"/>
@@ -8385,12 +8044,6 @@
         </w:tc>
       </w:tr>
       <w:tr>
-        <w:tblPrEx>
-          <w:tblCellMar>
-            <w:top w:w="0" w:type="dxa"/>
-            <w:bottom w:w="0" w:type="dxa"/>
-          </w:tblCellMar>
-        </w:tblPrEx>
         <w:tc>
           <w:tcPr>
             <w:tcW w:w="9200" w:type="dxa"/>
@@ -8509,12 +8162,6 @@
         <w:gridCol w:w="5800"/>
       </w:tblGrid>
       <w:tr>
-        <w:tblPrEx>
-          <w:tblCellMar>
-            <w:top w:w="0" w:type="dxa"/>
-            <w:bottom w:w="0" w:type="dxa"/>
-          </w:tblCellMar>
-        </w:tblPrEx>
         <w:trPr>
           <w:tblHeader/>
         </w:trPr>
@@ -8586,12 +8233,6 @@
         </w:tc>
       </w:tr>
       <w:tr>
-        <w:tblPrEx>
-          <w:tblCellMar>
-            <w:top w:w="0" w:type="dxa"/>
-            <w:bottom w:w="0" w:type="dxa"/>
-          </w:tblCellMar>
-        </w:tblPrEx>
         <w:tc>
           <w:tcPr>
             <w:tcW w:w="3200" w:type="dxa"/>
@@ -8705,12 +8346,6 @@
         </w:tc>
       </w:tr>
       <w:tr>
-        <w:tblPrEx>
-          <w:tblCellMar>
-            <w:top w:w="0" w:type="dxa"/>
-            <w:bottom w:w="0" w:type="dxa"/>
-          </w:tblCellMar>
-        </w:tblPrEx>
         <w:tc>
           <w:tcPr>
             <w:tcW w:w="3200" w:type="dxa"/>
@@ -8773,12 +8408,6 @@
         </w:tc>
       </w:tr>
       <w:tr>
-        <w:tblPrEx>
-          <w:tblCellMar>
-            <w:top w:w="0" w:type="dxa"/>
-            <w:bottom w:w="0" w:type="dxa"/>
-          </w:tblCellMar>
-        </w:tblPrEx>
         <w:tc>
           <w:tcPr>
             <w:tcW w:w="3200" w:type="dxa"/>
@@ -8892,12 +8521,6 @@
         </w:tc>
       </w:tr>
       <w:tr>
-        <w:tblPrEx>
-          <w:tblCellMar>
-            <w:top w:w="0" w:type="dxa"/>
-            <w:bottom w:w="0" w:type="dxa"/>
-          </w:tblCellMar>
-        </w:tblPrEx>
         <w:tc>
           <w:tcPr>
             <w:tcW w:w="3200" w:type="dxa"/>
@@ -8916,60 +8539,18 @@
             </w:tcMar>
           </w:tcPr>
           <w:p>
-            <w:r>
-              <w:rPr>
-                <w:sz w:val="18"/>
-                <w:szCs w:val="18"/>
-              </w:rPr>
-              <w:t xml:space="preserve">Jondrow et al. (1982). </w:t>
-            </w:r>
-            <w:proofErr w:type="spellStart"/>
-            <w:r>
-              <w:rPr>
-                <w:sz w:val="18"/>
-                <w:szCs w:val="18"/>
-              </w:rPr>
-              <w:t>Journal</w:t>
-            </w:r>
-            <w:proofErr w:type="spellEnd"/>
-            <w:r>
-              <w:rPr>
-                <w:sz w:val="18"/>
-                <w:szCs w:val="18"/>
-              </w:rPr>
-              <w:t xml:space="preserve"> </w:t>
-            </w:r>
-            <w:proofErr w:type="spellStart"/>
-            <w:r>
-              <w:rPr>
-                <w:sz w:val="18"/>
-                <w:szCs w:val="18"/>
-              </w:rPr>
-              <w:t>of</w:t>
-            </w:r>
-            <w:proofErr w:type="spellEnd"/>
-            <w:r>
-              <w:rPr>
-                <w:sz w:val="18"/>
-                <w:szCs w:val="18"/>
-              </w:rPr>
-              <w:t xml:space="preserve"> </w:t>
-            </w:r>
-            <w:proofErr w:type="spellStart"/>
-            <w:r>
-              <w:rPr>
-                <w:sz w:val="18"/>
-                <w:szCs w:val="18"/>
-              </w:rPr>
-              <w:t>Econometrics</w:t>
-            </w:r>
-            <w:proofErr w:type="spellEnd"/>
-            <w:r>
-              <w:rPr>
-                <w:sz w:val="18"/>
-                <w:szCs w:val="18"/>
-              </w:rPr>
-              <w:t>, 19.</w:t>
+            <w:pPr>
+              <w:rPr>
+                <w:lang w:val="en-US"/>
+              </w:rPr>
+            </w:pPr>
+            <w:r>
+              <w:rPr>
+                <w:sz w:val="18"/>
+                <w:szCs w:val="18"/>
+                <w:lang w:val="en-US"/>
+              </w:rPr>
+              <w:t>Jondrow et al. (1982). Journal of Econometrics, 19.</w:t>
             </w:r>
           </w:p>
         </w:tc>
@@ -9018,12 +8599,6 @@
         </w:tc>
       </w:tr>
       <w:tr>
-        <w:tblPrEx>
-          <w:tblCellMar>
-            <w:top w:w="0" w:type="dxa"/>
-            <w:bottom w:w="0" w:type="dxa"/>
-          </w:tblCellMar>
-        </w:tblPrEx>
         <w:tc>
           <w:tcPr>
             <w:tcW w:w="3200" w:type="dxa"/>
@@ -9102,12 +8677,6 @@
         </w:tc>
       </w:tr>
       <w:tr>
-        <w:tblPrEx>
-          <w:tblCellMar>
-            <w:top w:w="0" w:type="dxa"/>
-            <w:bottom w:w="0" w:type="dxa"/>
-          </w:tblCellMar>
-        </w:tblPrEx>
         <w:tc>
           <w:tcPr>
             <w:tcW w:w="3200" w:type="dxa"/>
@@ -9180,12 +8749,6 @@
         </w:tc>
       </w:tr>
       <w:tr>
-        <w:tblPrEx>
-          <w:tblCellMar>
-            <w:top w:w="0" w:type="dxa"/>
-            <w:bottom w:w="0" w:type="dxa"/>
-          </w:tblCellMar>
-        </w:tblPrEx>
         <w:tc>
           <w:tcPr>
             <w:tcW w:w="3200" w:type="dxa"/>
@@ -9268,12 +8831,6 @@
         <w:gridCol w:w="9200"/>
       </w:tblGrid>
       <w:tr>
-        <w:tblPrEx>
-          <w:tblCellMar>
-            <w:top w:w="0" w:type="dxa"/>
-            <w:bottom w:w="0" w:type="dxa"/>
-          </w:tblCellMar>
-        </w:tblPrEx>
         <w:tc>
           <w:tcPr>
             <w:tcW w:w="9200" w:type="dxa"/>

</xml_diff>